<commit_message>
updates to voltage dividers & misc. labs
</commit_message>
<xml_diff>
--- a/electronics_manual/M_problems/the_basics/I_V_measurements.docx
+++ b/electronics_manual/M_problems/the_basics/I_V_measurements.docx
@@ -2,6 +2,16 @@
 <file path=word/document.xml><?xml version="1.0" encoding="utf-8"?>
 <w:document xmlns:wpc="http://schemas.microsoft.com/office/word/2010/wordprocessingCanvas" xmlns:cx="http://schemas.microsoft.com/office/drawing/2014/chartex" xmlns:cx1="http://schemas.microsoft.com/office/drawing/2015/9/8/chartex" xmlns:cx2="http://schemas.microsoft.com/office/drawing/2015/10/21/chartex" xmlns:cx3="http://schemas.microsoft.com/office/drawing/2016/5/9/chartex" xmlns:cx4="http://schemas.microsoft.com/office/drawing/2016/5/10/chartex" xmlns:cx5="http://schemas.microsoft.com/office/drawing/2016/5/11/chartex" xmlns:cx6="http://schemas.microsoft.com/office/drawing/2016/5/12/chartex" xmlns:cx7="http://schemas.microsoft.com/office/drawing/2016/5/13/chartex" xmlns:cx8="http://schemas.microsoft.com/office/drawing/2016/5/14/chartex" xmlns:mc="http://schemas.openxmlformats.org/markup-compatibility/2006" xmlns:aink="http://schemas.microsoft.com/office/drawing/2016/ink" xmlns:am3d="http://schemas.microsoft.com/office/drawing/2017/model3d" xmlns:o="urn:schemas-microsoft-com:office:office" xmlns:oel="http://schemas.microsoft.com/office/2019/extlst" xmlns:r="http://schemas.openxmlformats.org/officeDocument/2006/relationships" xmlns:m="http://schemas.openxmlformats.org/officeDocument/2006/math" xmlns:v="urn:schemas-microsoft-com:vml" xmlns:wp14="http://schemas.microsoft.com/office/word/2010/wordprocessingDrawing" xmlns:wp="http://schemas.openxmlformats.org/drawingml/2006/wordprocessingDrawing" xmlns:w10="urn:schemas-microsoft-com:office:word" xmlns:w="http://schemas.openxmlformats.org/wordprocessingml/2006/main" xmlns:w14="http://schemas.microsoft.com/office/word/2010/wordml" xmlns:w15="http://schemas.microsoft.com/office/word/2012/wordml" xmlns:w16cex="http://schemas.microsoft.com/office/word/2018/wordml/cex" xmlns:w16cid="http://schemas.microsoft.com/office/word/2016/wordml/cid" xmlns:w16="http://schemas.microsoft.com/office/word/2018/wordml" xmlns:w16du="http://schemas.microsoft.com/office/word/2023/wordml/word16du" xmlns:w16sdtdh="http://schemas.microsoft.com/office/word/2020/wordml/sdtdatahash" xmlns:w16sdtfl="http://schemas.microsoft.com/office/word/2024/wordml/sdtformatlock" xmlns:w16se="http://schemas.microsoft.com/office/word/2015/wordml/symex" xmlns:wpg="http://schemas.microsoft.com/office/word/2010/wordprocessingGroup" xmlns:wpi="http://schemas.microsoft.com/office/word/2010/wordprocessingInk" xmlns:wne="http://schemas.microsoft.com/office/word/2006/wordml" xmlns:wps="http://schemas.microsoft.com/office/word/2010/wordprocessingShape" mc:Ignorable="w14 w15 w16se w16cid w16 w16cex w16sdtdh w16sdtfl w16du wp14">
   <w:body>
+    <w:p>
+      <w:pPr>
+        <w:spacing w:line="240" w:lineRule="auto"/>
+        <w:rPr>
+          <w:rFonts w:ascii="Times New Roman" w:hAnsi="Times New Roman" w:cs="Times New Roman"/>
+          <w:sz w:val="24"/>
+          <w:szCs w:val="24"/>
+        </w:rPr>
+      </w:pPr>
+    </w:p>
     <w:p>
       <w:pPr>
         <w:spacing w:line="240" w:lineRule="auto"/>
@@ -19,10 +29,10 @@
           <w:szCs w:val="24"/>
         </w:rPr>
         <w:drawing>
-          <wp:inline distT="0" distB="0" distL="0" distR="0" wp14:anchorId="4C9BCD9A" wp14:editId="47507E0D">
-            <wp:extent cx="3458210" cy="1638300"/>
-            <wp:effectExtent l="0" t="0" r="8890" b="0"/>
-            <wp:docPr id="754545581" name="Picture 2"/>
+          <wp:inline distT="0" distB="0" distL="0" distR="0" wp14:anchorId="610ECEEE" wp14:editId="6FF6D7B2">
+            <wp:extent cx="1746504" cy="1609344"/>
+            <wp:effectExtent l="0" t="0" r="6350" b="0"/>
+            <wp:docPr id="1815879100" name="Picture 1"/>
             <wp:cNvGraphicFramePr>
               <a:graphicFrameLocks xmlns:a="http://schemas.openxmlformats.org/drawingml/2006/main" noChangeAspect="1"/>
             </wp:cNvGraphicFramePr>
@@ -30,13 +40,13 @@
               <a:graphicData uri="http://schemas.openxmlformats.org/drawingml/2006/picture">
                 <pic:pic xmlns:pic="http://schemas.openxmlformats.org/drawingml/2006/picture">
                   <pic:nvPicPr>
-                    <pic:cNvPr id="0" name="Picture 2"/>
+                    <pic:cNvPr id="0" name="Picture 1"/>
                     <pic:cNvPicPr>
                       <a:picLocks noChangeAspect="1" noChangeArrowheads="1"/>
                     </pic:cNvPicPr>
                   </pic:nvPicPr>
                   <pic:blipFill>
-                    <a:blip r:embed="rId4">
+                    <a:blip r:embed="rId6">
                       <a:extLst>
                         <a:ext uri="{28A0092B-C50C-407E-A947-70E740481C1C}">
                           <a14:useLocalDpi xmlns:a14="http://schemas.microsoft.com/office/drawing/2010/main" val="0"/>
@@ -51,7 +61,71 @@
                   <pic:spPr bwMode="auto">
                     <a:xfrm>
                       <a:off x="0" y="0"/>
-                      <a:ext cx="3458210" cy="1638300"/>
+                      <a:ext cx="1746504" cy="1609344"/>
+                    </a:xfrm>
+                    <a:prstGeom prst="rect">
+                      <a:avLst/>
+                    </a:prstGeom>
+                    <a:noFill/>
+                    <a:ln>
+                      <a:noFill/>
+                    </a:ln>
+                  </pic:spPr>
+                </pic:pic>
+              </a:graphicData>
+            </a:graphic>
+          </wp:inline>
+        </w:drawing>
+      </w:r>
+      <w:r>
+        <w:rPr>
+          <w:rFonts w:ascii="Times New Roman" w:hAnsi="Times New Roman" w:cs="Times New Roman"/>
+          <w:sz w:val="24"/>
+          <w:szCs w:val="24"/>
+        </w:rPr>
+        <w:t xml:space="preserve">          </w:t>
+      </w:r>
+      <w:r>
+        <w:rPr>
+          <w:rFonts w:ascii="Times New Roman" w:hAnsi="Times New Roman" w:cs="Times New Roman"/>
+          <w:noProof/>
+          <w:sz w:val="24"/>
+          <w:szCs w:val="24"/>
+        </w:rPr>
+        <w:drawing>
+          <wp:inline distT="0" distB="0" distL="0" distR="0" wp14:anchorId="207D80A3" wp14:editId="01352C73">
+            <wp:extent cx="1746504" cy="1609344"/>
+            <wp:effectExtent l="0" t="0" r="6350" b="0"/>
+            <wp:docPr id="1033881180" name="Picture 2"/>
+            <wp:cNvGraphicFramePr>
+              <a:graphicFrameLocks xmlns:a="http://schemas.openxmlformats.org/drawingml/2006/main" noChangeAspect="1"/>
+            </wp:cNvGraphicFramePr>
+            <a:graphic xmlns:a="http://schemas.openxmlformats.org/drawingml/2006/main">
+              <a:graphicData uri="http://schemas.openxmlformats.org/drawingml/2006/picture">
+                <pic:pic xmlns:pic="http://schemas.openxmlformats.org/drawingml/2006/picture">
+                  <pic:nvPicPr>
+                    <pic:cNvPr id="0" name="Picture 2"/>
+                    <pic:cNvPicPr>
+                      <a:picLocks noChangeAspect="1" noChangeArrowheads="1"/>
+                    </pic:cNvPicPr>
+                  </pic:nvPicPr>
+                  <pic:blipFill>
+                    <a:blip r:embed="rId7">
+                      <a:extLst>
+                        <a:ext uri="{28A0092B-C50C-407E-A947-70E740481C1C}">
+                          <a14:useLocalDpi xmlns:a14="http://schemas.microsoft.com/office/drawing/2010/main" val="0"/>
+                        </a:ext>
+                      </a:extLst>
+                    </a:blip>
+                    <a:srcRect/>
+                    <a:stretch>
+                      <a:fillRect/>
+                    </a:stretch>
+                  </pic:blipFill>
+                  <pic:spPr bwMode="auto">
+                    <a:xfrm>
+                      <a:off x="0" y="0"/>
+                      <a:ext cx="1746504" cy="1609344"/>
                     </a:xfrm>
                     <a:prstGeom prst="rect">
                       <a:avLst/>
@@ -76,6 +150,56 @@
     </w:sectPr>
   </w:body>
 </w:document>
+</file>
+
+<file path=word/endnotes.xml><?xml version="1.0" encoding="utf-8"?>
+<w:endnotes xmlns:wpc="http://schemas.microsoft.com/office/word/2010/wordprocessingCanvas" xmlns:cx="http://schemas.microsoft.com/office/drawing/2014/chartex" xmlns:cx1="http://schemas.microsoft.com/office/drawing/2015/9/8/chartex" xmlns:cx2="http://schemas.microsoft.com/office/drawing/2015/10/21/chartex" xmlns:cx3="http://schemas.microsoft.com/office/drawing/2016/5/9/chartex" xmlns:cx4="http://schemas.microsoft.com/office/drawing/2016/5/10/chartex" xmlns:cx5="http://schemas.microsoft.com/office/drawing/2016/5/11/chartex" xmlns:cx6="http://schemas.microsoft.com/office/drawing/2016/5/12/chartex" xmlns:cx7="http://schemas.microsoft.com/office/drawing/2016/5/13/chartex" xmlns:cx8="http://schemas.microsoft.com/office/drawing/2016/5/14/chartex" xmlns:mc="http://schemas.openxmlformats.org/markup-compatibility/2006" xmlns:aink="http://schemas.microsoft.com/office/drawing/2016/ink" xmlns:am3d="http://schemas.microsoft.com/office/drawing/2017/model3d" xmlns:o="urn:schemas-microsoft-com:office:office" xmlns:oel="http://schemas.microsoft.com/office/2019/extlst" xmlns:r="http://schemas.openxmlformats.org/officeDocument/2006/relationships" xmlns:m="http://schemas.openxmlformats.org/officeDocument/2006/math" xmlns:v="urn:schemas-microsoft-com:vml" xmlns:wp14="http://schemas.microsoft.com/office/word/2010/wordprocessingDrawing" xmlns:wp="http://schemas.openxmlformats.org/drawingml/2006/wordprocessingDrawing" xmlns:w10="urn:schemas-microsoft-com:office:word" xmlns:w="http://schemas.openxmlformats.org/wordprocessingml/2006/main" xmlns:w14="http://schemas.microsoft.com/office/word/2010/wordml" xmlns:w15="http://schemas.microsoft.com/office/word/2012/wordml" xmlns:w16cex="http://schemas.microsoft.com/office/word/2018/wordml/cex" xmlns:w16cid="http://schemas.microsoft.com/office/word/2016/wordml/cid" xmlns:w16="http://schemas.microsoft.com/office/word/2018/wordml" xmlns:w16du="http://schemas.microsoft.com/office/word/2023/wordml/word16du" xmlns:w16sdtdh="http://schemas.microsoft.com/office/word/2020/wordml/sdtdatahash" xmlns:w16sdtfl="http://schemas.microsoft.com/office/word/2024/wordml/sdtformatlock" xmlns:w16se="http://schemas.microsoft.com/office/word/2015/wordml/symex" xmlns:wpg="http://schemas.microsoft.com/office/word/2010/wordprocessingGroup" xmlns:wpi="http://schemas.microsoft.com/office/word/2010/wordprocessingInk" xmlns:wne="http://schemas.microsoft.com/office/word/2006/wordml" xmlns:wps="http://schemas.microsoft.com/office/word/2010/wordprocessingShape" mc:Ignorable="w14 w15 w16se w16cid w16 w16cex w16sdtdh w16sdtfl w16du wp14">
+  <w:endnote w:type="separator" w:id="-1">
+    <w:p>
+      <w:pPr>
+        <w:spacing w:after="0" w:line="240" w:lineRule="auto"/>
+      </w:pPr>
+      <w:r>
+        <w:separator/>
+      </w:r>
+    </w:p>
+  </w:endnote>
+  <w:endnote w:type="continuationSeparator" w:id="0">
+    <w:p>
+      <w:pPr>
+        <w:spacing w:after="0" w:line="240" w:lineRule="auto"/>
+      </w:pPr>
+      <w:r>
+        <w:continuationSeparator/>
+      </w:r>
+    </w:p>
+  </w:endnote>
+</w:endnotes>
+</file>
+
+<file path=word/footnotes.xml><?xml version="1.0" encoding="utf-8"?>
+<w:footnotes xmlns:wpc="http://schemas.microsoft.com/office/word/2010/wordprocessingCanvas" xmlns:cx="http://schemas.microsoft.com/office/drawing/2014/chartex" xmlns:cx1="http://schemas.microsoft.com/office/drawing/2015/9/8/chartex" xmlns:cx2="http://schemas.microsoft.com/office/drawing/2015/10/21/chartex" xmlns:cx3="http://schemas.microsoft.com/office/drawing/2016/5/9/chartex" xmlns:cx4="http://schemas.microsoft.com/office/drawing/2016/5/10/chartex" xmlns:cx5="http://schemas.microsoft.com/office/drawing/2016/5/11/chartex" xmlns:cx6="http://schemas.microsoft.com/office/drawing/2016/5/12/chartex" xmlns:cx7="http://schemas.microsoft.com/office/drawing/2016/5/13/chartex" xmlns:cx8="http://schemas.microsoft.com/office/drawing/2016/5/14/chartex" xmlns:mc="http://schemas.openxmlformats.org/markup-compatibility/2006" xmlns:aink="http://schemas.microsoft.com/office/drawing/2016/ink" xmlns:am3d="http://schemas.microsoft.com/office/drawing/2017/model3d" xmlns:o="urn:schemas-microsoft-com:office:office" xmlns:oel="http://schemas.microsoft.com/office/2019/extlst" xmlns:r="http://schemas.openxmlformats.org/officeDocument/2006/relationships" xmlns:m="http://schemas.openxmlformats.org/officeDocument/2006/math" xmlns:v="urn:schemas-microsoft-com:vml" xmlns:wp14="http://schemas.microsoft.com/office/word/2010/wordprocessingDrawing" xmlns:wp="http://schemas.openxmlformats.org/drawingml/2006/wordprocessingDrawing" xmlns:w10="urn:schemas-microsoft-com:office:word" xmlns:w="http://schemas.openxmlformats.org/wordprocessingml/2006/main" xmlns:w14="http://schemas.microsoft.com/office/word/2010/wordml" xmlns:w15="http://schemas.microsoft.com/office/word/2012/wordml" xmlns:w16cex="http://schemas.microsoft.com/office/word/2018/wordml/cex" xmlns:w16cid="http://schemas.microsoft.com/office/word/2016/wordml/cid" xmlns:w16="http://schemas.microsoft.com/office/word/2018/wordml" xmlns:w16du="http://schemas.microsoft.com/office/word/2023/wordml/word16du" xmlns:w16sdtdh="http://schemas.microsoft.com/office/word/2020/wordml/sdtdatahash" xmlns:w16sdtfl="http://schemas.microsoft.com/office/word/2024/wordml/sdtformatlock" xmlns:w16se="http://schemas.microsoft.com/office/word/2015/wordml/symex" xmlns:wpg="http://schemas.microsoft.com/office/word/2010/wordprocessingGroup" xmlns:wpi="http://schemas.microsoft.com/office/word/2010/wordprocessingInk" xmlns:wne="http://schemas.microsoft.com/office/word/2006/wordml" xmlns:wps="http://schemas.microsoft.com/office/word/2010/wordprocessingShape" mc:Ignorable="w14 w15 w16se w16cid w16 w16cex w16sdtdh w16sdtfl w16du wp14">
+  <w:footnote w:type="separator" w:id="-1">
+    <w:p>
+      <w:pPr>
+        <w:spacing w:after="0" w:line="240" w:lineRule="auto"/>
+      </w:pPr>
+      <w:r>
+        <w:separator/>
+      </w:r>
+    </w:p>
+  </w:footnote>
+  <w:footnote w:type="continuationSeparator" w:id="0">
+    <w:p>
+      <w:pPr>
+        <w:spacing w:after="0" w:line="240" w:lineRule="auto"/>
+      </w:pPr>
+      <w:r>
+        <w:continuationSeparator/>
+      </w:r>
+    </w:p>
+  </w:footnote>
+</w:footnotes>
 </file>
 
 <file path=word/styles.xml><?xml version="1.0" encoding="utf-8"?>
@@ -996,6 +1120,50 @@
       <w:spacing w:val="5"/>
     </w:rPr>
   </w:style>
+  <w:style w:type="paragraph" w:styleId="Header">
+    <w:name w:val="header"/>
+    <w:basedOn w:val="Normal"/>
+    <w:link w:val="HeaderChar"/>
+    <w:uiPriority w:val="99"/>
+    <w:unhideWhenUsed/>
+    <w:rsid w:val="00F23CF1"/>
+    <w:pPr>
+      <w:tabs>
+        <w:tab w:val="center" w:pos="4680"/>
+        <w:tab w:val="right" w:pos="9360"/>
+      </w:tabs>
+      <w:spacing w:after="0" w:line="240" w:lineRule="auto"/>
+    </w:pPr>
+  </w:style>
+  <w:style w:type="character" w:customStyle="1" w:styleId="HeaderChar">
+    <w:name w:val="Header Char"/>
+    <w:basedOn w:val="DefaultParagraphFont"/>
+    <w:link w:val="Header"/>
+    <w:uiPriority w:val="99"/>
+    <w:rsid w:val="00F23CF1"/>
+  </w:style>
+  <w:style w:type="paragraph" w:styleId="Footer">
+    <w:name w:val="footer"/>
+    <w:basedOn w:val="Normal"/>
+    <w:link w:val="FooterChar"/>
+    <w:uiPriority w:val="99"/>
+    <w:unhideWhenUsed/>
+    <w:rsid w:val="00F23CF1"/>
+    <w:pPr>
+      <w:tabs>
+        <w:tab w:val="center" w:pos="4680"/>
+        <w:tab w:val="right" w:pos="9360"/>
+      </w:tabs>
+      <w:spacing w:after="0" w:line="240" w:lineRule="auto"/>
+    </w:pPr>
+  </w:style>
+  <w:style w:type="character" w:customStyle="1" w:styleId="FooterChar">
+    <w:name w:val="Footer Char"/>
+    <w:basedOn w:val="DefaultParagraphFont"/>
+    <w:link w:val="Footer"/>
+    <w:uiPriority w:val="99"/>
+    <w:rsid w:val="00F23CF1"/>
+  </w:style>
 </w:styles>
 </file>
 

</xml_diff>